<commit_message>
Redacción de las evaluaciones y conclusiones de los modelos desarrollados en el reporte para la entrega 2 del micro proyecto
</commit_message>
<xml_diff>
--- a/Reporte Entrega 2 - Microproyecto.docx
+++ b/Reporte Entrega 2 - Microproyecto.docx
@@ -1144,7 +1144,27 @@
           <w:color w:val="0F172A"/>
           <w:sz w:val="19"/>
         </w:rPr>
-        <w:t xml:space="preserve"> (Deep Learning 1D-CNN + </w:t>
+        <w:t xml:space="preserve"> (Deep </w:t>
+      </w:r>
+      <w:proofErr w:type="spellStart"/>
+      <w:r>
+        <w:rPr>
+          <w:rFonts w:ascii="Montserrat SemiBold" w:hAnsi="Montserrat SemiBold"/>
+          <w:b/>
+          <w:color w:val="0F172A"/>
+          <w:sz w:val="19"/>
+        </w:rPr>
+        <w:t>Learning</w:t>
+      </w:r>
+      <w:proofErr w:type="spellEnd"/>
+      <w:r>
+        <w:rPr>
+          <w:rFonts w:ascii="Montserrat SemiBold" w:hAnsi="Montserrat SemiBold"/>
+          <w:b/>
+          <w:color w:val="0F172A"/>
+          <w:sz w:val="19"/>
+        </w:rPr>
+        <w:t xml:space="preserve"> 1D-CNN + </w:t>
       </w:r>
       <w:proofErr w:type="spellStart"/>
       <w:r>
@@ -1603,25 +1623,7 @@
           <w:color w:val="1E293B"/>
           <w:sz w:val="19"/>
         </w:rPr>
-        <w:t xml:space="preserve"> Server respaldado en SQLite y directorio de artefactos dedicado, garantizando que cada corrida registre de forma inmutable: </w:t>
-      </w:r>
-      <w:proofErr w:type="spellStart"/>
-      <w:r>
-        <w:rPr>
-          <w:rFonts w:ascii="Montserrat Light" w:hAnsi="Montserrat Light"/>
-          <w:color w:val="1E293B"/>
-          <w:sz w:val="19"/>
-        </w:rPr>
-        <w:t>hiperparámetros</w:t>
-      </w:r>
-      <w:proofErr w:type="spellEnd"/>
-      <w:r>
-        <w:rPr>
-          <w:rFonts w:ascii="Montserrat Light" w:hAnsi="Montserrat Light"/>
-          <w:color w:val="1E293B"/>
-          <w:sz w:val="19"/>
-        </w:rPr>
-        <w:t xml:space="preserve"> (</w:t>
+        <w:t xml:space="preserve"> Server respaldado en SQLite y directorio de artefactos dedicado, garantizando que cada corrida registre de forma inmutable: hiperparámetros (</w:t>
       </w:r>
       <w:proofErr w:type="spellStart"/>
       <w:r>
@@ -2398,289 +2400,743 @@
     </w:p>
     <w:p>
       <w:pPr>
-        <w:keepNext/>
-        <w:spacing w:before="280" w:after="80"/>
+        <w:pBdr>
+          <w:bottom w:val="single" w:sz="8" w:space="4" w:color="5B57D1"/>
+        </w:pBdr>
+        <w:spacing w:before="360" w:after="120"/>
+        <w:rPr>
+          <w:rFonts w:ascii="Montserrat SemiBold" w:eastAsia="Montserrat SemiBold" w:hAnsi="Montserrat SemiBold" w:cs="Montserrat SemiBold"/>
+        </w:rPr>
       </w:pPr>
       <w:r>
         <w:rPr>
-          <w:rFonts w:ascii="Montserrat SemiBold" w:hAnsi="Montserrat SemiBold"/>
+          <w:rFonts w:ascii="Montserrat SemiBold" w:eastAsia="Montserrat SemiBold" w:hAnsi="Montserrat SemiBold" w:cs="Montserrat SemiBold"/>
           <w:b/>
-          <w:color w:val="1E3A8A"/>
-          <w:sz w:val="28"/>
+          <w:bCs/>
+          <w:color w:val="5B57D1"/>
+          <w:sz w:val="30"/>
+          <w:szCs w:val="30"/>
         </w:rPr>
         <w:lastRenderedPageBreak/>
-        <w:t>4. Observaciones Clínicas y Conclusiones sobre los Modelos</w:t>
+        <w:t>Observaciones y conclusiones sobre los modelos</w:t>
       </w:r>
     </w:p>
     <w:p>
       <w:pPr>
-        <w:spacing w:before="40" w:after="80"/>
+        <w:spacing w:after="160"/>
+        <w:jc w:val="both"/>
+        <w:rPr>
+          <w:rFonts w:ascii="Montserrat Light" w:eastAsia="Montserrat Light" w:hAnsi="Montserrat Light" w:cs="Montserrat Light"/>
+        </w:rPr>
       </w:pPr>
       <w:r>
-        <w:rPr>
-          <w:rFonts w:ascii="Montserrat SemiBold" w:hAnsi="Montserrat SemiBold"/>
+        <w:t xml:space="preserve"> </w:t>
+      </w:r>
+      <w:r>
+        <w:rPr>
+          <w:rFonts w:ascii="Montserrat Light" w:eastAsia="Montserrat Light" w:hAnsi="Montserrat Light" w:cs="Montserrat Light"/>
           <w:b/>
-          <w:color w:val="0F172A"/>
-          <w:sz w:val="19"/>
-        </w:rPr>
-        <w:t xml:space="preserve">Rendimiento Comparativo y Separabilidad Espectral: </w:t>
+          <w:bCs/>
+        </w:rPr>
+        <w:t xml:space="preserve">Rendimiento </w:t>
+      </w:r>
+      <w:r>
+        <w:rPr>
+          <w:rFonts w:ascii="Montserrat Light" w:eastAsia="Montserrat Light" w:hAnsi="Montserrat Light" w:cs="Montserrat Light"/>
+          <w:b/>
+          <w:bCs/>
+        </w:rPr>
+        <w:t>c</w:t>
+      </w:r>
+      <w:r>
+        <w:rPr>
+          <w:rFonts w:ascii="Montserrat Light" w:eastAsia="Montserrat Light" w:hAnsi="Montserrat Light" w:cs="Montserrat Light"/>
+          <w:b/>
+          <w:bCs/>
+        </w:rPr>
+        <w:t xml:space="preserve">omparativo y </w:t>
+      </w:r>
+      <w:r>
+        <w:rPr>
+          <w:rFonts w:ascii="Montserrat Light" w:eastAsia="Montserrat Light" w:hAnsi="Montserrat Light" w:cs="Montserrat Light"/>
+          <w:b/>
+          <w:bCs/>
+        </w:rPr>
+        <w:t>s</w:t>
+      </w:r>
+      <w:r>
+        <w:rPr>
+          <w:rFonts w:ascii="Montserrat Light" w:eastAsia="Montserrat Light" w:hAnsi="Montserrat Light" w:cs="Montserrat Light"/>
+          <w:b/>
+          <w:bCs/>
+        </w:rPr>
+        <w:t xml:space="preserve">eparabilidad </w:t>
+      </w:r>
+      <w:r>
+        <w:rPr>
+          <w:rFonts w:ascii="Montserrat Light" w:eastAsia="Montserrat Light" w:hAnsi="Montserrat Light" w:cs="Montserrat Light"/>
+          <w:b/>
+          <w:bCs/>
+        </w:rPr>
+        <w:t>e</w:t>
+      </w:r>
+      <w:r>
+        <w:rPr>
+          <w:rFonts w:ascii="Montserrat Light" w:eastAsia="Montserrat Light" w:hAnsi="Montserrat Light" w:cs="Montserrat Light"/>
+          <w:b/>
+          <w:bCs/>
+        </w:rPr>
+        <w:t>spectral:</w:t>
+      </w:r>
+      <w:r>
+        <w:rPr>
+          <w:rFonts w:ascii="Montserrat Light" w:eastAsia="Montserrat Light" w:hAnsi="Montserrat Light" w:cs="Montserrat Light"/>
+        </w:rPr>
+        <w:t xml:space="preserve"> </w:t>
       </w:r>
       <w:proofErr w:type="spellStart"/>
       <w:r>
         <w:rPr>
-          <w:rFonts w:ascii="Montserrat Light" w:hAnsi="Montserrat Light"/>
-          <w:color w:val="1E293B"/>
-          <w:sz w:val="19"/>
+          <w:rFonts w:ascii="Montserrat Light" w:eastAsia="Montserrat Light" w:hAnsi="Montserrat Light" w:cs="Montserrat Light"/>
         </w:rPr>
         <w:t>LightGBM</w:t>
       </w:r>
       <w:proofErr w:type="spellEnd"/>
       <w:r>
         <w:rPr>
-          <w:rFonts w:ascii="Montserrat Light" w:hAnsi="Montserrat Light"/>
-          <w:color w:val="1E293B"/>
-          <w:sz w:val="19"/>
+          <w:rFonts w:ascii="Montserrat Light" w:eastAsia="Montserrat Light" w:hAnsi="Montserrat Light" w:cs="Montserrat Light"/>
         </w:rPr>
         <w:t xml:space="preserve"> emergió como el modelo superior en todas las métricas clínicas globales, alcanzando un Macro F1-Score de 0.5525 y un coeficiente Kappa de Cohen de 0.5424 (acuerdo sustancial según los criterios de Landis &amp; Koch). Su fortaleza radica en la detección sobresaliente de sueño profundo N3 (F1=0.7112) y sueño ligero N2 (F1=0.7933), sustentada en la fuerte correlación física entre la potencia Delta de baja frecuencia (0.5–4 Hz) y el estadio N3, así como la actividad Sigma (12–16 Hz) para los </w:t>
       </w:r>
-      <w:proofErr w:type="spellStart"/>
-      <w:r>
-        <w:rPr>
-          <w:rFonts w:ascii="Montserrat Light" w:hAnsi="Montserrat Light"/>
-          <w:color w:val="1E293B"/>
-          <w:sz w:val="19"/>
-        </w:rPr>
-        <w:t>husos</w:t>
-      </w:r>
-      <w:proofErr w:type="spellEnd"/>
-      <w:r>
-        <w:rPr>
-          <w:rFonts w:ascii="Montserrat Light" w:hAnsi="Montserrat Light"/>
-          <w:color w:val="1E293B"/>
-          <w:sz w:val="19"/>
+      <w:r>
+        <w:rPr>
+          <w:rFonts w:ascii="Montserrat Light" w:eastAsia="Montserrat Light" w:hAnsi="Montserrat Light" w:cs="Montserrat Light"/>
+        </w:rPr>
+        <w:t>usos</w:t>
+      </w:r>
+      <w:r>
+        <w:rPr>
+          <w:rFonts w:ascii="Montserrat Light" w:eastAsia="Montserrat Light" w:hAnsi="Montserrat Light" w:cs="Montserrat Light"/>
         </w:rPr>
         <w:t xml:space="preserve"> de sueño en N2.</w:t>
       </w:r>
     </w:p>
     <w:p>
       <w:pPr>
-        <w:spacing w:before="40" w:after="80"/>
+        <w:spacing w:after="160"/>
+        <w:jc w:val="both"/>
+        <w:rPr>
+          <w:rFonts w:ascii="Montserrat Light" w:eastAsia="Montserrat Light" w:hAnsi="Montserrat Light" w:cs="Montserrat Light"/>
+        </w:rPr>
       </w:pPr>
       <w:r>
         <w:rPr>
-          <w:rFonts w:ascii="Montserrat SemiBold" w:hAnsi="Montserrat SemiBold"/>
+          <w:rFonts w:ascii="Montserrat Light" w:eastAsia="Montserrat Light" w:hAnsi="Montserrat Light" w:cs="Montserrat Light"/>
           <w:b/>
-          <w:color w:val="0F172A"/>
-          <w:sz w:val="19"/>
-        </w:rPr>
-        <w:t xml:space="preserve">La Falacia de la Exactitud frente al Desbalance de Clases: </w:t>
-      </w:r>
-      <w:r>
-        <w:rPr>
-          <w:rFonts w:ascii="Montserrat Light" w:hAnsi="Montserrat Light"/>
-          <w:color w:val="1E293B"/>
-          <w:sz w:val="19"/>
-        </w:rPr>
-        <w:t>La evaluación cuantitativa ratifica la limitación de utilizar la Exactitud (</w:t>
+          <w:bCs/>
+        </w:rPr>
+        <w:t xml:space="preserve">La </w:t>
+      </w:r>
+      <w:r>
+        <w:rPr>
+          <w:rFonts w:ascii="Montserrat Light" w:eastAsia="Montserrat Light" w:hAnsi="Montserrat Light" w:cs="Montserrat Light"/>
+          <w:b/>
+          <w:bCs/>
+        </w:rPr>
+        <w:t>paradoja</w:t>
+      </w:r>
+      <w:r>
+        <w:rPr>
+          <w:rFonts w:ascii="Montserrat Light" w:eastAsia="Montserrat Light" w:hAnsi="Montserrat Light" w:cs="Montserrat Light"/>
+          <w:b/>
+          <w:bCs/>
+        </w:rPr>
+        <w:t xml:space="preserve"> de la </w:t>
+      </w:r>
+      <w:r>
+        <w:rPr>
+          <w:rFonts w:ascii="Montserrat Light" w:eastAsia="Montserrat Light" w:hAnsi="Montserrat Light" w:cs="Montserrat Light"/>
+          <w:b/>
+          <w:bCs/>
+        </w:rPr>
+        <w:t>e</w:t>
+      </w:r>
+      <w:r>
+        <w:rPr>
+          <w:rFonts w:ascii="Montserrat Light" w:eastAsia="Montserrat Light" w:hAnsi="Montserrat Light" w:cs="Montserrat Light"/>
+          <w:b/>
+          <w:bCs/>
+        </w:rPr>
+        <w:t xml:space="preserve">xactitud frente al </w:t>
+      </w:r>
+      <w:r>
+        <w:rPr>
+          <w:rFonts w:ascii="Montserrat Light" w:eastAsia="Montserrat Light" w:hAnsi="Montserrat Light" w:cs="Montserrat Light"/>
+          <w:b/>
+          <w:bCs/>
+        </w:rPr>
+        <w:t>d</w:t>
+      </w:r>
+      <w:r>
+        <w:rPr>
+          <w:rFonts w:ascii="Montserrat Light" w:eastAsia="Montserrat Light" w:hAnsi="Montserrat Light" w:cs="Montserrat Light"/>
+          <w:b/>
+          <w:bCs/>
+        </w:rPr>
+        <w:t xml:space="preserve">esbalance de </w:t>
+      </w:r>
+      <w:r>
+        <w:rPr>
+          <w:rFonts w:ascii="Montserrat Light" w:eastAsia="Montserrat Light" w:hAnsi="Montserrat Light" w:cs="Montserrat Light"/>
+          <w:b/>
+          <w:bCs/>
+        </w:rPr>
+        <w:t>c</w:t>
+      </w:r>
+      <w:r>
+        <w:rPr>
+          <w:rFonts w:ascii="Montserrat Light" w:eastAsia="Montserrat Light" w:hAnsi="Montserrat Light" w:cs="Montserrat Light"/>
+          <w:b/>
+          <w:bCs/>
+        </w:rPr>
+        <w:t>lases:</w:t>
+      </w:r>
+      <w:r>
+        <w:rPr>
+          <w:rFonts w:ascii="Montserrat Light" w:eastAsia="Montserrat Light" w:hAnsi="Montserrat Light" w:cs="Montserrat Light"/>
+        </w:rPr>
+        <w:t xml:space="preserve"> La evaluación cuantitativa ratifica la limitación de utilizar la Exactitud (</w:t>
       </w:r>
       <w:proofErr w:type="spellStart"/>
       <w:r>
         <w:rPr>
-          <w:rFonts w:ascii="Montserrat Light" w:hAnsi="Montserrat Light"/>
-          <w:color w:val="1E293B"/>
-          <w:sz w:val="19"/>
+          <w:rFonts w:ascii="Montserrat Light" w:eastAsia="Montserrat Light" w:hAnsi="Montserrat Light" w:cs="Montserrat Light"/>
         </w:rPr>
         <w:t>Accuracy</w:t>
       </w:r>
       <w:proofErr w:type="spellEnd"/>
       <w:r>
         <w:rPr>
-          <w:rFonts w:ascii="Montserrat Light" w:hAnsi="Montserrat Light"/>
-          <w:color w:val="1E293B"/>
-          <w:sz w:val="19"/>
+          <w:rFonts w:ascii="Montserrat Light" w:eastAsia="Montserrat Light" w:hAnsi="Montserrat Light" w:cs="Montserrat Light"/>
         </w:rPr>
         <w:t xml:space="preserve">) como métrica primaria en polisomnografía. En </w:t>
       </w:r>
       <w:proofErr w:type="spellStart"/>
       <w:r>
         <w:rPr>
-          <w:rFonts w:ascii="Montserrat Light" w:hAnsi="Montserrat Light"/>
-          <w:color w:val="1E293B"/>
-          <w:sz w:val="19"/>
+          <w:rFonts w:ascii="Montserrat Light" w:eastAsia="Montserrat Light" w:hAnsi="Montserrat Light" w:cs="Montserrat Light"/>
         </w:rPr>
         <w:t>TinySleepNet</w:t>
       </w:r>
       <w:proofErr w:type="spellEnd"/>
       <w:r>
         <w:rPr>
-          <w:rFonts w:ascii="Montserrat Light" w:hAnsi="Montserrat Light"/>
-          <w:color w:val="1E293B"/>
-          <w:sz w:val="19"/>
+          <w:rFonts w:ascii="Montserrat Light" w:eastAsia="Montserrat Light" w:hAnsi="Montserrat Light" w:cs="Montserrat Light"/>
         </w:rPr>
         <w:t xml:space="preserve">, una exactitud superficial de 50.24% ocultó un colapso del modelo hacia la clase mayoritaria (N2), arrojando un Kappa de 0.0000. Por el contrario, el Macro F1-Score y el Kappa ponderan equitativamente la capacidad de discernir estadios </w:t>
       </w:r>
-      <w:proofErr w:type="gramStart"/>
-      <w:r>
-        <w:rPr>
-          <w:rFonts w:ascii="Montserrat Light" w:hAnsi="Montserrat Light"/>
-          <w:color w:val="1E293B"/>
-          <w:sz w:val="19"/>
-        </w:rPr>
-        <w:t>minoritarios</w:t>
-      </w:r>
-      <w:proofErr w:type="gramEnd"/>
-      <w:r>
-        <w:rPr>
-          <w:rFonts w:ascii="Montserrat Light" w:hAnsi="Montserrat Light"/>
-          <w:color w:val="1E293B"/>
-          <w:sz w:val="19"/>
+      <w:r>
+        <w:rPr>
+          <w:rFonts w:ascii="Montserrat Light" w:eastAsia="Montserrat Light" w:hAnsi="Montserrat Light" w:cs="Montserrat Light"/>
+        </w:rPr>
+        <w:t>minoritarios,</w:t>
+      </w:r>
+      <w:r>
+        <w:rPr>
+          <w:rFonts w:ascii="Montserrat Light" w:eastAsia="Montserrat Light" w:hAnsi="Montserrat Light" w:cs="Montserrat Light"/>
         </w:rPr>
         <w:t xml:space="preserve"> pero clínicamente cruciales como REM (F1=0.3836 en </w:t>
       </w:r>
       <w:proofErr w:type="spellStart"/>
       <w:r>
         <w:rPr>
-          <w:rFonts w:ascii="Montserrat Light" w:hAnsi="Montserrat Light"/>
-          <w:color w:val="1E293B"/>
-          <w:sz w:val="19"/>
+          <w:rFonts w:ascii="Montserrat Light" w:eastAsia="Montserrat Light" w:hAnsi="Montserrat Light" w:cs="Montserrat Light"/>
         </w:rPr>
         <w:t>LightGBM</w:t>
       </w:r>
       <w:proofErr w:type="spellEnd"/>
       <w:r>
         <w:rPr>
-          <w:rFonts w:ascii="Montserrat Light" w:hAnsi="Montserrat Light"/>
-          <w:color w:val="1E293B"/>
-          <w:sz w:val="19"/>
+          <w:rFonts w:ascii="Montserrat Light" w:eastAsia="Montserrat Light" w:hAnsi="Montserrat Light" w:cs="Montserrat Light"/>
         </w:rPr>
         <w:t>) y N1.</w:t>
       </w:r>
     </w:p>
     <w:p>
       <w:pPr>
-        <w:spacing w:before="40" w:after="80"/>
+        <w:spacing w:after="160"/>
+        <w:jc w:val="both"/>
+        <w:rPr>
+          <w:rFonts w:ascii="Montserrat Light" w:eastAsia="Montserrat Light" w:hAnsi="Montserrat Light" w:cs="Montserrat Light"/>
+        </w:rPr>
       </w:pPr>
       <w:r>
         <w:rPr>
-          <w:rFonts w:ascii="Montserrat SemiBold" w:hAnsi="Montserrat SemiBold"/>
+          <w:rFonts w:ascii="Montserrat Light" w:eastAsia="Montserrat Light" w:hAnsi="Montserrat Light" w:cs="Montserrat Light"/>
           <w:b/>
-          <w:color w:val="0F172A"/>
-          <w:sz w:val="19"/>
-        </w:rPr>
-        <w:t xml:space="preserve">Diagnóstico del Estadio N1 y Transiciones: </w:t>
-      </w:r>
-      <w:r>
-        <w:rPr>
-          <w:rFonts w:ascii="Montserrat Light" w:hAnsi="Montserrat Light"/>
-          <w:color w:val="1E293B"/>
-          <w:sz w:val="19"/>
-        </w:rPr>
-        <w:t xml:space="preserve">El estadio N1 sigue representando el mayor desafío diagnóstico en EEG </w:t>
+          <w:bCs/>
+        </w:rPr>
+        <w:t xml:space="preserve">Diagnóstico del </w:t>
+      </w:r>
+      <w:r>
+        <w:rPr>
+          <w:rFonts w:ascii="Montserrat Light" w:eastAsia="Montserrat Light" w:hAnsi="Montserrat Light" w:cs="Montserrat Light"/>
+          <w:b/>
+          <w:bCs/>
+        </w:rPr>
+        <w:t>e</w:t>
+      </w:r>
+      <w:r>
+        <w:rPr>
+          <w:rFonts w:ascii="Montserrat Light" w:eastAsia="Montserrat Light" w:hAnsi="Montserrat Light" w:cs="Montserrat Light"/>
+          <w:b/>
+          <w:bCs/>
+        </w:rPr>
+        <w:t xml:space="preserve">stadio N1 y </w:t>
+      </w:r>
+      <w:r>
+        <w:rPr>
+          <w:rFonts w:ascii="Montserrat Light" w:eastAsia="Montserrat Light" w:hAnsi="Montserrat Light" w:cs="Montserrat Light"/>
+          <w:b/>
+          <w:bCs/>
+        </w:rPr>
+        <w:t>t</w:t>
+      </w:r>
+      <w:r>
+        <w:rPr>
+          <w:rFonts w:ascii="Montserrat Light" w:eastAsia="Montserrat Light" w:hAnsi="Montserrat Light" w:cs="Montserrat Light"/>
+          <w:b/>
+          <w:bCs/>
+        </w:rPr>
+        <w:t>ransiciones:</w:t>
+      </w:r>
+      <w:r>
+        <w:rPr>
+          <w:rFonts w:ascii="Montserrat Light" w:eastAsia="Montserrat Light" w:hAnsi="Montserrat Light" w:cs="Montserrat Light"/>
+        </w:rPr>
+        <w:t xml:space="preserve"> El estadio N1 sigue representando el mayor desafío diagnóstico en EEG </w:t>
       </w:r>
       <w:proofErr w:type="spellStart"/>
       <w:r>
         <w:rPr>
-          <w:rFonts w:ascii="Montserrat Light" w:hAnsi="Montserrat Light"/>
-          <w:color w:val="1E293B"/>
-          <w:sz w:val="19"/>
+          <w:rFonts w:ascii="Montserrat Light" w:eastAsia="Montserrat Light" w:hAnsi="Montserrat Light" w:cs="Montserrat Light"/>
         </w:rPr>
         <w:t>mono-canal</w:t>
       </w:r>
       <w:proofErr w:type="spellEnd"/>
       <w:r>
         <w:rPr>
-          <w:rFonts w:ascii="Montserrat Light" w:hAnsi="Montserrat Light"/>
-          <w:color w:val="1E293B"/>
-          <w:sz w:val="19"/>
+          <w:rFonts w:ascii="Montserrat Light" w:eastAsia="Montserrat Light" w:hAnsi="Montserrat Light" w:cs="Montserrat Light"/>
         </w:rPr>
         <w:t xml:space="preserve"> (F1=0.0874), lo cual concuerda con la literatura científica donde incluso técnicos humanos presentan una concordancia </w:t>
       </w:r>
       <w:proofErr w:type="spellStart"/>
       <w:r>
         <w:rPr>
-          <w:rFonts w:ascii="Montserrat Light" w:hAnsi="Montserrat Light"/>
-          <w:color w:val="1E293B"/>
-          <w:sz w:val="19"/>
+          <w:rFonts w:ascii="Montserrat Light" w:eastAsia="Montserrat Light" w:hAnsi="Montserrat Light" w:cs="Montserrat Light"/>
         </w:rPr>
         <w:t>inter-evaluador</w:t>
       </w:r>
       <w:proofErr w:type="spellEnd"/>
       <w:r>
         <w:rPr>
-          <w:rFonts w:ascii="Montserrat Light" w:hAnsi="Montserrat Light"/>
-          <w:color w:val="1E293B"/>
-          <w:sz w:val="19"/>
+          <w:rFonts w:ascii="Montserrat Light" w:eastAsia="Montserrat Light" w:hAnsi="Montserrat Light" w:cs="Montserrat Light"/>
         </w:rPr>
         <w:t xml:space="preserve"> de apenas 60–65% en este estadio de transición. Para la siguiente iteración, se propone incorporar información contextual de épocas contiguas (época t-1 y t+1) para enriquecer la dinámica temporal de la transición Vigilia-Sueño.</w:t>
       </w:r>
     </w:p>
     <w:p>
       <w:pPr>
-        <w:spacing w:before="40" w:after="80"/>
+        <w:spacing w:after="160"/>
+        <w:jc w:val="both"/>
+        <w:rPr>
+          <w:rFonts w:ascii="Montserrat Light" w:eastAsia="Montserrat Light" w:hAnsi="Montserrat Light" w:cs="Montserrat Light"/>
+        </w:rPr>
       </w:pPr>
       <w:proofErr w:type="spellStart"/>
       <w:r>
         <w:rPr>
-          <w:rFonts w:ascii="Montserrat SemiBold" w:hAnsi="Montserrat SemiBold"/>
+          <w:rFonts w:ascii="Montserrat Light" w:eastAsia="Montserrat Light" w:hAnsi="Montserrat Light" w:cs="Montserrat Light"/>
           <w:b/>
-          <w:color w:val="0F172A"/>
-          <w:sz w:val="19"/>
+          <w:bCs/>
         </w:rPr>
         <w:t>Trade-offs</w:t>
       </w:r>
       <w:proofErr w:type="spellEnd"/>
       <w:r>
         <w:rPr>
-          <w:rFonts w:ascii="Montserrat SemiBold" w:hAnsi="Montserrat SemiBold"/>
+          <w:rFonts w:ascii="Montserrat Light" w:eastAsia="Montserrat Light" w:hAnsi="Montserrat Light" w:cs="Montserrat Light"/>
           <w:b/>
-          <w:color w:val="0F172A"/>
-          <w:sz w:val="19"/>
-        </w:rPr>
-        <w:t xml:space="preserve"> de Despliegue (Latencia vs Interpretabilidad): </w:t>
-      </w:r>
-      <w:r>
-        <w:rPr>
-          <w:rFonts w:ascii="Montserrat Light" w:hAnsi="Montserrat Light"/>
-          <w:color w:val="1E293B"/>
-          <w:sz w:val="19"/>
-        </w:rPr>
-        <w:t xml:space="preserve">Para un entorno clínico asistencial, </w:t>
+          <w:bCs/>
+        </w:rPr>
+        <w:t xml:space="preserve"> de </w:t>
+      </w:r>
+      <w:r>
+        <w:rPr>
+          <w:rFonts w:ascii="Montserrat Light" w:eastAsia="Montserrat Light" w:hAnsi="Montserrat Light" w:cs="Montserrat Light"/>
+          <w:b/>
+          <w:bCs/>
+        </w:rPr>
+        <w:t>d</w:t>
+      </w:r>
+      <w:r>
+        <w:rPr>
+          <w:rFonts w:ascii="Montserrat Light" w:eastAsia="Montserrat Light" w:hAnsi="Montserrat Light" w:cs="Montserrat Light"/>
+          <w:b/>
+          <w:bCs/>
+        </w:rPr>
+        <w:t>espliegue (Latencia vs Interpretabilidad):</w:t>
+      </w:r>
+      <w:r>
+        <w:rPr>
+          <w:rFonts w:ascii="Montserrat Light" w:eastAsia="Montserrat Light" w:hAnsi="Montserrat Light" w:cs="Montserrat Light"/>
+        </w:rPr>
+        <w:t xml:space="preserve"> Para un entorno clínico asistencial, </w:t>
       </w:r>
       <w:proofErr w:type="spellStart"/>
       <w:r>
         <w:rPr>
-          <w:rFonts w:ascii="Montserrat Light" w:hAnsi="Montserrat Light"/>
-          <w:color w:val="1E293B"/>
-          <w:sz w:val="19"/>
+          <w:rFonts w:ascii="Montserrat Light" w:eastAsia="Montserrat Light" w:hAnsi="Montserrat Light" w:cs="Montserrat Light"/>
         </w:rPr>
         <w:t>LightGBM</w:t>
       </w:r>
       <w:proofErr w:type="spellEnd"/>
       <w:r>
         <w:rPr>
-          <w:rFonts w:ascii="Montserrat Light" w:hAnsi="Montserrat Light"/>
-          <w:color w:val="1E293B"/>
-          <w:sz w:val="19"/>
+          <w:rFonts w:ascii="Montserrat Light" w:eastAsia="Montserrat Light" w:hAnsi="Montserrat Light" w:cs="Montserrat Light"/>
         </w:rPr>
         <w:t xml:space="preserve"> ofrece una latencia de inferencia inferior a 0.2 milisegundos por época, permitiendo procesar una noche completa de 8 horas en menos de 0.5 segundos en cualquier computadora estándar sin GPU. Además, la importancia de variables calculada por ganancia de información confirma la centralidad biológica de las potencias relativas Delta y Sigma, aportando transparencia y </w:t>
       </w:r>
       <w:proofErr w:type="spellStart"/>
       <w:r>
         <w:rPr>
-          <w:rFonts w:ascii="Montserrat Light" w:hAnsi="Montserrat Light"/>
-          <w:color w:val="1E293B"/>
-          <w:sz w:val="19"/>
+          <w:rFonts w:ascii="Montserrat Light" w:eastAsia="Montserrat Light" w:hAnsi="Montserrat Light" w:cs="Montserrat Light"/>
         </w:rPr>
         <w:t>explicabilidad</w:t>
       </w:r>
       <w:proofErr w:type="spellEnd"/>
       <w:r>
         <w:rPr>
-          <w:rFonts w:ascii="Montserrat Light" w:hAnsi="Montserrat Light"/>
-          <w:color w:val="1E293B"/>
-          <w:sz w:val="19"/>
+          <w:rFonts w:ascii="Montserrat Light" w:eastAsia="Montserrat Light" w:hAnsi="Montserrat Light" w:cs="Montserrat Light"/>
         </w:rPr>
         <w:t xml:space="preserve"> médica ante el profesional de la salud.</w:t>
+      </w:r>
+    </w:p>
+    <w:p>
+      <w:pPr>
+        <w:spacing w:after="160"/>
+        <w:jc w:val="both"/>
+        <w:rPr>
+          <w:rFonts w:ascii="Montserrat Light" w:eastAsia="Montserrat Light" w:hAnsi="Montserrat Light" w:cs="Montserrat Light"/>
+          <w:b/>
+          <w:bCs/>
+        </w:rPr>
+      </w:pPr>
+      <w:r>
+        <w:rPr>
+          <w:rFonts w:ascii="Montserrat Light" w:eastAsia="Montserrat Light" w:hAnsi="Montserrat Light" w:cs="Montserrat Light"/>
+          <w:b/>
+          <w:bCs/>
+        </w:rPr>
+        <w:t xml:space="preserve">Experimentos registrados en </w:t>
+      </w:r>
+      <w:proofErr w:type="spellStart"/>
+      <w:r>
+        <w:rPr>
+          <w:rFonts w:ascii="Montserrat Light" w:eastAsia="Montserrat Light" w:hAnsi="Montserrat Light" w:cs="Montserrat Light"/>
+          <w:b/>
+          <w:bCs/>
+        </w:rPr>
+        <w:t>MLflow</w:t>
+      </w:r>
+      <w:proofErr w:type="spellEnd"/>
+      <w:r>
+        <w:rPr>
+          <w:rFonts w:ascii="Montserrat Light" w:eastAsia="Montserrat Light" w:hAnsi="Montserrat Light" w:cs="Montserrat Light"/>
+          <w:b/>
+          <w:bCs/>
+        </w:rPr>
+        <w:t xml:space="preserve">: </w:t>
+      </w:r>
+      <w:r>
+        <w:rPr>
+          <w:rFonts w:ascii="Montserrat Light" w:eastAsia="Montserrat Light" w:hAnsi="Montserrat Light" w:cs="Montserrat Light"/>
+        </w:rPr>
+        <w:t xml:space="preserve">Conforme a las buenas prácticas de </w:t>
+      </w:r>
+      <w:proofErr w:type="spellStart"/>
+      <w:r>
+        <w:rPr>
+          <w:rFonts w:ascii="Montserrat Light" w:eastAsia="Montserrat Light" w:hAnsi="Montserrat Light" w:cs="Montserrat Light"/>
+        </w:rPr>
+        <w:t>MLOps</w:t>
+      </w:r>
+      <w:proofErr w:type="spellEnd"/>
+      <w:r>
+        <w:rPr>
+          <w:rFonts w:ascii="Montserrat Light" w:eastAsia="Montserrat Light" w:hAnsi="Montserrat Light" w:cs="Montserrat Light"/>
+        </w:rPr>
+        <w:t xml:space="preserve"> y los lineamientos del curso (Taller 4), el seguimiento de experimentos se centralizó en una instancia remota de AWS EC2 (Ubuntu 24.04 LTS, IP pública: 54.235.50.255, puertos 5000 y 8050) administrada bajo llave SSH '</w:t>
+      </w:r>
+      <w:proofErr w:type="spellStart"/>
+      <w:r>
+        <w:rPr>
+          <w:rFonts w:ascii="Montserrat Light" w:eastAsia="Montserrat Light" w:hAnsi="Montserrat Light" w:cs="Montserrat Light"/>
+        </w:rPr>
+        <w:t>dashsh_energia_keys.pem</w:t>
+      </w:r>
+      <w:proofErr w:type="spellEnd"/>
+      <w:r>
+        <w:rPr>
+          <w:rFonts w:ascii="Montserrat Light" w:eastAsia="Montserrat Light" w:hAnsi="Montserrat Light" w:cs="Montserrat Light"/>
+        </w:rPr>
+        <w:t xml:space="preserve">'. En la instancia se configuró un servicio persistente de </w:t>
+      </w:r>
+      <w:proofErr w:type="spellStart"/>
+      <w:r>
+        <w:rPr>
+          <w:rFonts w:ascii="Montserrat Light" w:eastAsia="Montserrat Light" w:hAnsi="Montserrat Light" w:cs="Montserrat Light"/>
+        </w:rPr>
+        <w:t>MLflow</w:t>
+      </w:r>
+      <w:proofErr w:type="spellEnd"/>
+      <w:r>
+        <w:rPr>
+          <w:rFonts w:ascii="Montserrat Light" w:eastAsia="Montserrat Light" w:hAnsi="Montserrat Light" w:cs="Montserrat Light"/>
+        </w:rPr>
+        <w:t xml:space="preserve"> Server respaldado en SQLite y directorio de artefactos dedicado, garantizando que cada corrida registre de forma inmutable: hiperparámetros (</w:t>
+      </w:r>
+      <w:proofErr w:type="spellStart"/>
+      <w:r>
+        <w:rPr>
+          <w:rFonts w:ascii="Montserrat Light" w:eastAsia="Montserrat Light" w:hAnsi="Montserrat Light" w:cs="Montserrat Light"/>
+        </w:rPr>
+        <w:t>n_estimators</w:t>
+      </w:r>
+      <w:proofErr w:type="spellEnd"/>
+      <w:r>
+        <w:rPr>
+          <w:rFonts w:ascii="Montserrat Light" w:eastAsia="Montserrat Light" w:hAnsi="Montserrat Light" w:cs="Montserrat Light"/>
+        </w:rPr>
+        <w:t xml:space="preserve">, </w:t>
+      </w:r>
+      <w:proofErr w:type="spellStart"/>
+      <w:r>
+        <w:rPr>
+          <w:rFonts w:ascii="Montserrat Light" w:eastAsia="Montserrat Light" w:hAnsi="Montserrat Light" w:cs="Montserrat Light"/>
+        </w:rPr>
+        <w:t>learning_rate</w:t>
+      </w:r>
+      <w:proofErr w:type="spellEnd"/>
+      <w:r>
+        <w:rPr>
+          <w:rFonts w:ascii="Montserrat Light" w:eastAsia="Montserrat Light" w:hAnsi="Montserrat Light" w:cs="Montserrat Light"/>
+        </w:rPr>
+        <w:t xml:space="preserve">, </w:t>
+      </w:r>
+      <w:proofErr w:type="spellStart"/>
+      <w:r>
+        <w:rPr>
+          <w:rFonts w:ascii="Montserrat Light" w:eastAsia="Montserrat Light" w:hAnsi="Montserrat Light" w:cs="Montserrat Light"/>
+        </w:rPr>
+        <w:t>batch_size</w:t>
+      </w:r>
+      <w:proofErr w:type="spellEnd"/>
+      <w:r>
+        <w:rPr>
+          <w:rFonts w:ascii="Montserrat Light" w:eastAsia="Montserrat Light" w:hAnsi="Montserrat Light" w:cs="Montserrat Light"/>
+        </w:rPr>
+        <w:t>), métricas escalares por época (F1 Macro, Kappa, Exactitud, pérdida de entrenamiento), gráficos de evaluación (matrices de confusión en PNG) y los artefactos serializados de los modelos.</w:t>
+      </w:r>
+    </w:p>
+    <w:p>
+      <w:pPr>
+        <w:spacing w:after="160"/>
+        <w:jc w:val="both"/>
+        <w:rPr>
+          <w:rFonts w:ascii="Montserrat Light" w:eastAsia="Montserrat Light" w:hAnsi="Montserrat Light" w:cs="Montserrat Light"/>
+        </w:rPr>
+      </w:pPr>
+      <w:r>
+        <w:rPr>
+          <w:rFonts w:ascii="Montserrat Light" w:eastAsia="Montserrat Light" w:hAnsi="Montserrat Light" w:cs="Montserrat Light"/>
+        </w:rPr>
+        <w:t>La siguiente imagen muestra la consola de la instancia con el usuario activo y la dirección IP asignada, evidenciando el entorno de ejecución utilizado durante el desarrollo del proyecto.</w:t>
+      </w:r>
+    </w:p>
+    <w:p>
+      <w:pPr>
+        <w:spacing w:after="160"/>
+        <w:jc w:val="center"/>
+        <w:rPr>
+          <w:rFonts w:ascii="Montserrat Light" w:eastAsia="Montserrat Light" w:hAnsi="Montserrat Light" w:cs="Montserrat Light"/>
+        </w:rPr>
+      </w:pPr>
+      <w:r>
+        <w:rPr>
+          <w:rFonts w:ascii="Montserrat Light" w:eastAsia="Montserrat Light" w:hAnsi="Montserrat Light" w:cs="Montserrat Light"/>
+          <w:noProof/>
+        </w:rPr>
+        <w:lastRenderedPageBreak/>
+        <w:drawing>
+          <wp:inline distT="0" distB="0" distL="0" distR="0" wp14:anchorId="054976B9" wp14:editId="1E8BCD59">
+            <wp:extent cx="4454957" cy="3265337"/>
+            <wp:effectExtent l="0" t="0" r="3175" b="0"/>
+            <wp:docPr id="2009843999" name="Imagen 3"/>
+            <wp:cNvGraphicFramePr>
+              <a:graphicFrameLocks xmlns:a="http://schemas.openxmlformats.org/drawingml/2006/main" noChangeAspect="1"/>
+            </wp:cNvGraphicFramePr>
+            <a:graphic xmlns:a="http://schemas.openxmlformats.org/drawingml/2006/main">
+              <a:graphicData uri="http://schemas.openxmlformats.org/drawingml/2006/picture">
+                <pic:pic xmlns:pic="http://schemas.openxmlformats.org/drawingml/2006/picture">
+                  <pic:nvPicPr>
+                    <pic:cNvPr id="0" name="Picture 15"/>
+                    <pic:cNvPicPr>
+                      <a:picLocks noChangeAspect="1" noChangeArrowheads="1"/>
+                    </pic:cNvPicPr>
+                  </pic:nvPicPr>
+                  <pic:blipFill rotWithShape="1">
+                    <a:blip r:embed="rId11" cstate="print">
+                      <a:extLst>
+                        <a:ext uri="{28A0092B-C50C-407E-A947-70E740481C1C}">
+                          <a14:useLocalDpi xmlns:a14="http://schemas.microsoft.com/office/drawing/2010/main" val="0"/>
+                        </a:ext>
+                      </a:extLst>
+                    </a:blip>
+                    <a:srcRect b="6442"/>
+                    <a:stretch>
+                      <a:fillRect/>
+                    </a:stretch>
+                  </pic:blipFill>
+                  <pic:spPr bwMode="auto">
+                    <a:xfrm>
+                      <a:off x="0" y="0"/>
+                      <a:ext cx="4469356" cy="3275891"/>
+                    </a:xfrm>
+                    <a:prstGeom prst="rect">
+                      <a:avLst/>
+                    </a:prstGeom>
+                    <a:noFill/>
+                    <a:ln>
+                      <a:noFill/>
+                    </a:ln>
+                    <a:extLst>
+                      <a:ext uri="{53640926-AAD7-44D8-BBD7-CCE9431645EC}">
+                        <a14:shadowObscured xmlns:a14="http://schemas.microsoft.com/office/drawing/2010/main"/>
+                      </a:ext>
+                    </a:extLst>
+                  </pic:spPr>
+                </pic:pic>
+              </a:graphicData>
+            </a:graphic>
+          </wp:inline>
+        </w:drawing>
+      </w:r>
+    </w:p>
+    <w:p>
+      <w:pPr>
+        <w:spacing w:after="160"/>
+        <w:jc w:val="both"/>
+        <w:rPr>
+          <w:rFonts w:ascii="Montserrat Light" w:eastAsia="Montserrat Light" w:hAnsi="Montserrat Light" w:cs="Montserrat Light"/>
+        </w:rPr>
+      </w:pPr>
+      <w:r>
+        <w:rPr>
+          <w:rFonts w:ascii="Montserrat Light" w:eastAsia="Montserrat Light" w:hAnsi="Montserrat Light" w:cs="Montserrat Light"/>
+        </w:rPr>
+        <w:t xml:space="preserve">Una vez levantado el servidor de </w:t>
+      </w:r>
+      <w:proofErr w:type="spellStart"/>
+      <w:r>
+        <w:rPr>
+          <w:rFonts w:ascii="Montserrat Light" w:eastAsia="Montserrat Light" w:hAnsi="Montserrat Light" w:cs="Montserrat Light"/>
+        </w:rPr>
+        <w:t>MLflow</w:t>
+      </w:r>
+      <w:proofErr w:type="spellEnd"/>
+      <w:r>
+        <w:rPr>
+          <w:rFonts w:ascii="Montserrat Light" w:eastAsia="Montserrat Light" w:hAnsi="Montserrat Light" w:cs="Montserrat Light"/>
+        </w:rPr>
+        <w:t xml:space="preserve"> sobre la instancia EC2, se accedió a la interfaz web a través de la IP pública de la máquina. La siguiente captura muestra el tablero de </w:t>
+      </w:r>
+      <w:proofErr w:type="spellStart"/>
+      <w:r>
+        <w:rPr>
+          <w:rFonts w:ascii="Montserrat Light" w:eastAsia="Montserrat Light" w:hAnsi="Montserrat Light" w:cs="Montserrat Light"/>
+        </w:rPr>
+        <w:t>MLflow</w:t>
+      </w:r>
+      <w:proofErr w:type="spellEnd"/>
+      <w:r>
+        <w:rPr>
+          <w:rFonts w:ascii="Montserrat Light" w:eastAsia="Montserrat Light" w:hAnsi="Montserrat Light" w:cs="Montserrat Light"/>
+        </w:rPr>
+        <w:t xml:space="preserve"> ejecutándose correctamente, confirmando que el servicio corre sobre la infraestructura desplegada en la nube.</w:t>
+      </w:r>
+    </w:p>
+    <w:p>
+      <w:pPr>
+        <w:spacing w:after="160"/>
+        <w:jc w:val="center"/>
+        <w:rPr>
+          <w:rFonts w:ascii="Montserrat Light" w:eastAsia="Montserrat Light" w:hAnsi="Montserrat Light" w:cs="Montserrat Light"/>
+        </w:rPr>
+      </w:pPr>
+      <w:r>
+        <w:rPr>
+          <w:rFonts w:ascii="Montserrat Light" w:eastAsia="Montserrat Light" w:hAnsi="Montserrat Light" w:cs="Montserrat Light"/>
+          <w:noProof/>
+        </w:rPr>
+        <w:drawing>
+          <wp:inline distT="0" distB="0" distL="0" distR="0" wp14:anchorId="635F87A0" wp14:editId="407D35F5">
+            <wp:extent cx="4593946" cy="2966923"/>
+            <wp:effectExtent l="0" t="0" r="0" b="5080"/>
+            <wp:docPr id="1184404445" name="Imagen 7"/>
+            <wp:cNvGraphicFramePr>
+              <a:graphicFrameLocks xmlns:a="http://schemas.openxmlformats.org/drawingml/2006/main" noChangeAspect="1"/>
+            </wp:cNvGraphicFramePr>
+            <a:graphic xmlns:a="http://schemas.openxmlformats.org/drawingml/2006/main">
+              <a:graphicData uri="http://schemas.openxmlformats.org/drawingml/2006/picture">
+                <pic:pic xmlns:pic="http://schemas.openxmlformats.org/drawingml/2006/picture">
+                  <pic:nvPicPr>
+                    <pic:cNvPr id="0" name="Picture 29"/>
+                    <pic:cNvPicPr>
+                      <a:picLocks noChangeAspect="1" noChangeArrowheads="1"/>
+                    </pic:cNvPicPr>
+                  </pic:nvPicPr>
+                  <pic:blipFill>
+                    <a:blip r:embed="rId12" cstate="print">
+                      <a:extLst>
+                        <a:ext uri="{28A0092B-C50C-407E-A947-70E740481C1C}">
+                          <a14:useLocalDpi xmlns:a14="http://schemas.microsoft.com/office/drawing/2010/main" val="0"/>
+                        </a:ext>
+                      </a:extLst>
+                    </a:blip>
+                    <a:srcRect/>
+                    <a:stretch>
+                      <a:fillRect/>
+                    </a:stretch>
+                  </pic:blipFill>
+                  <pic:spPr bwMode="auto">
+                    <a:xfrm>
+                      <a:off x="0" y="0"/>
+                      <a:ext cx="4614659" cy="2980300"/>
+                    </a:xfrm>
+                    <a:prstGeom prst="rect">
+                      <a:avLst/>
+                    </a:prstGeom>
+                    <a:noFill/>
+                    <a:ln>
+                      <a:noFill/>
+                    </a:ln>
+                  </pic:spPr>
+                </pic:pic>
+              </a:graphicData>
+            </a:graphic>
+          </wp:inline>
+        </w:drawing>
       </w:r>
     </w:p>
     <w:p>
@@ -2778,6 +3234,7 @@
         <w:rPr>
           <w:rFonts w:ascii="Times New Roman" w:eastAsia="Montserrat Light" w:hAnsi="Times New Roman" w:cs="Times New Roman"/>
         </w:rPr>
+        <w:lastRenderedPageBreak/>
         <w:t>●</w:t>
       </w:r>
       <w:r>
@@ -2830,14 +3287,7 @@
         <w:rPr>
           <w:rFonts w:ascii="Montserrat Light" w:eastAsia="Montserrat Light" w:hAnsi="Montserrat Light" w:cs="Montserrat Light"/>
         </w:rPr>
-        <w:t xml:space="preserve"> Permite seleccionar registros de polisomnografía </w:t>
-      </w:r>
-      <w:proofErr w:type="gramStart"/>
-      <w:r>
-        <w:rPr>
-          <w:rFonts w:ascii="Montserrat Light" w:eastAsia="Montserrat Light" w:hAnsi="Montserrat Light" w:cs="Montserrat Light"/>
-        </w:rPr>
-        <w:t>(.</w:t>
+        <w:t xml:space="preserve"> Permite seleccionar registros de polisomnografía (.</w:t>
       </w:r>
       <w:proofErr w:type="spellStart"/>
       <w:r>
@@ -2847,7 +3297,6 @@
         <w:t>edf</w:t>
       </w:r>
       <w:proofErr w:type="spellEnd"/>
-      <w:proofErr w:type="gramEnd"/>
       <w:r>
         <w:rPr>
           <w:rFonts w:ascii="Montserrat Light" w:eastAsia="Montserrat Light" w:hAnsi="Montserrat Light" w:cs="Montserrat Light"/>
@@ -3144,7 +3593,6 @@
           <w:b/>
           <w:bCs/>
         </w:rPr>
-        <w:lastRenderedPageBreak/>
         <w:t xml:space="preserve">Trazabilidad y </w:t>
       </w:r>
       <w:r>
@@ -3349,7 +3797,7 @@
           <w:noProof/>
         </w:rPr>
         <w:drawing>
-          <wp:inline distT="0" distB="0" distL="0" distR="0" wp14:anchorId="509AC3FE" wp14:editId="5C5DB6B2">
+          <wp:inline distT="0" distB="0" distL="0" distR="0" wp14:anchorId="509AC3FE" wp14:editId="791F4A95">
             <wp:extent cx="6140548" cy="3362072"/>
             <wp:effectExtent l="0" t="0" r="0" b="0"/>
             <wp:docPr id="414592301" name="Imagen 10"/>
@@ -3366,7 +3814,7 @@
                     </pic:cNvPicPr>
                   </pic:nvPicPr>
                   <pic:blipFill>
-                    <a:blip r:embed="rId11" cstate="print">
+                    <a:blip r:embed="rId13" cstate="print">
                       <a:extLst>
                         <a:ext uri="{28A0092B-C50C-407E-A947-70E740481C1C}">
                           <a14:useLocalDpi xmlns:a14="http://schemas.microsoft.com/office/drawing/2010/main" val="0"/>
@@ -3411,8 +3859,9 @@
           <w:rFonts w:ascii="Montserrat Light" w:eastAsia="Montserrat Light" w:hAnsi="Montserrat Light" w:cs="Montserrat Light"/>
           <w:noProof/>
         </w:rPr>
+        <w:lastRenderedPageBreak/>
         <w:drawing>
-          <wp:inline distT="0" distB="0" distL="0" distR="0" wp14:anchorId="1236B930" wp14:editId="586B16D7">
+          <wp:inline distT="0" distB="0" distL="0" distR="0" wp14:anchorId="1236B930" wp14:editId="40E3AAE1">
             <wp:extent cx="6144422" cy="3371508"/>
             <wp:effectExtent l="0" t="0" r="8890" b="635"/>
             <wp:docPr id="2090997923" name="Imagen 12"/>
@@ -3429,7 +3878,7 @@
                     </pic:cNvPicPr>
                   </pic:nvPicPr>
                   <pic:blipFill>
-                    <a:blip r:embed="rId12" cstate="print">
+                    <a:blip r:embed="rId14" cstate="print">
                       <a:extLst>
                         <a:ext uri="{28A0092B-C50C-407E-A947-70E740481C1C}">
                           <a14:useLocalDpi xmlns:a14="http://schemas.microsoft.com/office/drawing/2010/main" val="0"/>
@@ -3903,7 +4352,7 @@
       </w:pPr>
     </w:p>
     <w:sectPr>
-      <w:footerReference w:type="default" r:id="rId13"/>
+      <w:footerReference w:type="default" r:id="rId15"/>
       <w:pgSz w:w="12240" w:h="15840"/>
       <w:pgMar w:top="1008" w:right="1080" w:bottom="1008" w:left="1080" w:header="720" w:footer="720" w:gutter="0"/>
       <w:pgNumType w:start="0"/>

</xml_diff>